<commit_message>
Add deployment fixes, screenshots and final report
- Numeric UID so Kubernetes runAsNonRoot works
- Load image into Docker Desktop's kind node in deploy script
- Expose Prometheus/Grafana via LoadBalancer
- Screenshots for MLflow, CI, Docker, Kubernetes and monitoring
- Rebuilt REPORT.docx
</commit_message>
<xml_diff>
--- a/reports/REPORT.docx
+++ b/reports/REPORT.docx
@@ -85,7 +85,7 @@
           <w:rPr>
             <w:rStyle w:val="Hyperlink"/>
           </w:rPr>
-          <w:t xml:space="preserve">https://github.com/YOUR-USERNAME/heart-disease-mlops</w:t>
+          <w:t xml:space="preserve">https://github.com/jangde-aboli/MLOPs_assignment_HeartML</w:t>
         </w:r>
       </w:hyperlink>
     </w:p>
@@ -395,7 +395,7 @@
         <w:rPr>
           <w:rStyle w:val="VerbatimChar"/>
         </w:rPr>
-        <w:t xml:space="preserve">git clone https://github.com/YOUR-USERNAME/heart-disease-mlops.git &amp;&amp; cd heart-disease-mlops</w:t>
+        <w:t xml:space="preserve">git clone https://github.com/jangde-aboli/MLOPs_assignment_HeartML.git &amp;&amp; cd MLOPs_assignment_HeartML</w:t>
       </w:r>
       <w:r>
         <w:br/>
@@ -2929,7 +2929,7 @@
     </w:p>
     <w:bookmarkEnd w:id="42"/>
     <w:bookmarkEnd w:id="43"/>
-    <w:bookmarkStart w:id="45" w:name="experiment-tracking-mlflow"/>
+    <w:bookmarkStart w:id="54" w:name="experiment-tracking-mlflow"/>
     <w:p>
       <w:pPr>
         <w:pStyle w:val="Heading1"/>
@@ -3240,31 +3240,53 @@
         <w:t xml:space="preserve">.</w:t>
       </w:r>
     </w:p>
-    <w:tbl>
-      <w:tblPr>
-        <w:tblStyle w:val="FigureTable"/>
-        <w:tblW w:type="auto" w:w="0"/>
-        <w:jc w:val="center"/>
-        <w:tblLook w:firstRow="0" w:lastRow="0" w:firstColumn="0" w:lastColumn="0"/>
-      </w:tblPr>
-      <w:tblGrid>
-        <w:gridCol w:w="7920"/>
-      </w:tblGrid>
-      <w:tr>
-        <w:tc>
-          <w:tcPr/>
-          <w:p>
-            <w:pPr>
-              <w:pStyle w:val="Compact"/>
-              <w:jc w:val="center"/>
-            </w:pPr>
-            <w:r>
-              <w:t xml:space="preserve">MLflow runs</w:t>
-            </w:r>
-          </w:p>
-        </w:tc>
-      </w:tr>
-    </w:tbl>
+    <w:p>
+      <w:pPr>
+        <w:pStyle w:val="CaptionedFigure"/>
+      </w:pPr>
+      <w:r>
+        <w:drawing>
+          <wp:inline>
+            <wp:extent cx="5334000" cy="3339459"/>
+            <wp:effectExtent b="0" l="0" r="0" t="0"/>
+            <wp:docPr descr="MLflow runs" title="" id="46" name="Picture"/>
+            <a:graphic>
+              <a:graphicData uri="http://schemas.openxmlformats.org/drawingml/2006/picture">
+                <pic:pic>
+                  <pic:nvPicPr>
+                    <pic:cNvPr descr="../screenshots/mlflow_runs.png" id="47" name="Picture"/>
+                    <pic:cNvPicPr>
+                      <a:picLocks noChangeArrowheads="1" noChangeAspect="1"/>
+                    </pic:cNvPicPr>
+                  </pic:nvPicPr>
+                  <pic:blipFill>
+                    <a:blip r:embed="rId45"/>
+                    <a:stretch>
+                      <a:fillRect/>
+                    </a:stretch>
+                  </pic:blipFill>
+                  <pic:spPr bwMode="auto">
+                    <a:xfrm>
+                      <a:off x="0" y="0"/>
+                      <a:ext cx="5334000" cy="3339459"/>
+                    </a:xfrm>
+                    <a:prstGeom prst="rect">
+                      <a:avLst/>
+                    </a:prstGeom>
+                    <a:noFill/>
+                    <a:ln w="9525">
+                      <a:noFill/>
+                      <a:headEnd/>
+                      <a:tailEnd/>
+                    </a:ln>
+                  </pic:spPr>
+                </pic:pic>
+              </a:graphicData>
+            </a:graphic>
+          </wp:inline>
+        </w:drawing>
+      </w:r>
+    </w:p>
     <w:p>
       <w:pPr>
         <w:pStyle w:val="ImageCaption"/>
@@ -3273,31 +3295,53 @@
         <w:t xml:space="preserve">MLflow runs</w:t>
       </w:r>
     </w:p>
-    <w:tbl>
-      <w:tblPr>
-        <w:tblStyle w:val="FigureTable"/>
-        <w:tblW w:type="auto" w:w="0"/>
-        <w:jc w:val="center"/>
-        <w:tblLook w:firstRow="0" w:lastRow="0" w:firstColumn="0" w:lastColumn="0"/>
-      </w:tblPr>
-      <w:tblGrid>
-        <w:gridCol w:w="7920"/>
-      </w:tblGrid>
-      <w:tr>
-        <w:tc>
-          <w:tcPr/>
-          <w:p>
-            <w:pPr>
-              <w:pStyle w:val="Compact"/>
-              <w:jc w:val="center"/>
-            </w:pPr>
-            <w:r>
-              <w:t xml:space="preserve">MLflow run detail</w:t>
-            </w:r>
-          </w:p>
-        </w:tc>
-      </w:tr>
-    </w:tbl>
+    <w:p>
+      <w:pPr>
+        <w:pStyle w:val="CaptionedFigure"/>
+      </w:pPr>
+      <w:r>
+        <w:drawing>
+          <wp:inline>
+            <wp:extent cx="5334000" cy="2812523"/>
+            <wp:effectExtent b="0" l="0" r="0" t="0"/>
+            <wp:docPr descr="MLflow run detail" title="" id="49" name="Picture"/>
+            <a:graphic>
+              <a:graphicData uri="http://schemas.openxmlformats.org/drawingml/2006/picture">
+                <pic:pic>
+                  <pic:nvPicPr>
+                    <pic:cNvPr descr="../screenshots/mlflow_run_detail.png" id="50" name="Picture"/>
+                    <pic:cNvPicPr>
+                      <a:picLocks noChangeArrowheads="1" noChangeAspect="1"/>
+                    </pic:cNvPicPr>
+                  </pic:nvPicPr>
+                  <pic:blipFill>
+                    <a:blip r:embed="rId48"/>
+                    <a:stretch>
+                      <a:fillRect/>
+                    </a:stretch>
+                  </pic:blipFill>
+                  <pic:spPr bwMode="auto">
+                    <a:xfrm>
+                      <a:off x="0" y="0"/>
+                      <a:ext cx="5334000" cy="2812523"/>
+                    </a:xfrm>
+                    <a:prstGeom prst="rect">
+                      <a:avLst/>
+                    </a:prstGeom>
+                    <a:noFill/>
+                    <a:ln w="9525">
+                      <a:noFill/>
+                      <a:headEnd/>
+                      <a:tailEnd/>
+                    </a:ln>
+                  </pic:spPr>
+                </pic:pic>
+              </a:graphicData>
+            </a:graphic>
+          </wp:inline>
+        </w:drawing>
+      </w:r>
+    </w:p>
     <w:p>
       <w:pPr>
         <w:pStyle w:val="ImageCaption"/>
@@ -3306,8 +3350,63 @@
         <w:t xml:space="preserve">MLflow run detail</w:t>
       </w:r>
     </w:p>
-    <w:bookmarkEnd w:id="45"/>
-    <w:bookmarkStart w:id="46" w:name="packaging-and-reproducibility"/>
+    <w:p>
+      <w:pPr>
+        <w:pStyle w:val="CaptionedFigure"/>
+      </w:pPr>
+      <w:r>
+        <w:drawing>
+          <wp:inline>
+            <wp:extent cx="5334000" cy="1676956"/>
+            <wp:effectExtent b="0" l="0" r="0" t="0"/>
+            <wp:docPr descr="MLflow model registry" title="" id="52" name="Picture"/>
+            <a:graphic>
+              <a:graphicData uri="http://schemas.openxmlformats.org/drawingml/2006/picture">
+                <pic:pic>
+                  <pic:nvPicPr>
+                    <pic:cNvPr descr="../screenshots/mlflow_registry.png" id="53" name="Picture"/>
+                    <pic:cNvPicPr>
+                      <a:picLocks noChangeArrowheads="1" noChangeAspect="1"/>
+                    </pic:cNvPicPr>
+                  </pic:nvPicPr>
+                  <pic:blipFill>
+                    <a:blip r:embed="rId51"/>
+                    <a:stretch>
+                      <a:fillRect/>
+                    </a:stretch>
+                  </pic:blipFill>
+                  <pic:spPr bwMode="auto">
+                    <a:xfrm>
+                      <a:off x="0" y="0"/>
+                      <a:ext cx="5334000" cy="1676956"/>
+                    </a:xfrm>
+                    <a:prstGeom prst="rect">
+                      <a:avLst/>
+                    </a:prstGeom>
+                    <a:noFill/>
+                    <a:ln w="9525">
+                      <a:noFill/>
+                      <a:headEnd/>
+                      <a:tailEnd/>
+                    </a:ln>
+                  </pic:spPr>
+                </pic:pic>
+              </a:graphicData>
+            </a:graphic>
+          </wp:inline>
+        </w:drawing>
+      </w:r>
+    </w:p>
+    <w:p>
+      <w:pPr>
+        <w:pStyle w:val="ImageCaption"/>
+      </w:pPr>
+      <w:r>
+        <w:t xml:space="preserve">MLflow model registry</w:t>
+      </w:r>
+    </w:p>
+    <w:bookmarkEnd w:id="54"/>
+    <w:bookmarkStart w:id="55" w:name="packaging-and-reproducibility"/>
     <w:p>
       <w:pPr>
         <w:pStyle w:val="Heading1"/>
@@ -3509,8 +3608,8 @@
         <w:t xml:space="preserve">package, so no logic is copied into notebooks.</w:t>
       </w:r>
     </w:p>
-    <w:bookmarkEnd w:id="46"/>
-    <w:bookmarkStart w:id="49" w:name="cicd-pipeline-and-automated-testing"/>
+    <w:bookmarkEnd w:id="55"/>
+    <w:bookmarkStart w:id="64" w:name="cicd-pipeline-and-automated-testing"/>
     <w:p>
       <w:pPr>
         <w:pStyle w:val="Heading1"/>
@@ -3519,7 +3618,7 @@
         <w:t xml:space="preserve">7. CI/CD pipeline and automated testing</w:t>
       </w:r>
     </w:p>
-    <w:bookmarkStart w:id="47" w:name="unit-tests-tests-25-tests"/>
+    <w:bookmarkStart w:id="56" w:name="unit-tests-tests-25-tests"/>
     <w:p>
       <w:pPr>
         <w:pStyle w:val="Heading2"/>
@@ -3731,8 +3830,8 @@
         <w:t xml:space="preserve">clone without the real dataset or a trained model.</w:t>
       </w:r>
     </w:p>
-    <w:bookmarkEnd w:id="47"/>
-    <w:bookmarkStart w:id="48" w:name="github-actions-.githubworkflowsci.yml"/>
+    <w:bookmarkEnd w:id="56"/>
+    <w:bookmarkStart w:id="63" w:name="github-actions-.githubworkflowsci.yml"/>
     <w:p>
       <w:pPr>
         <w:pStyle w:val="Heading2"/>
@@ -4151,31 +4250,53 @@
         <w:t xml:space="preserve">including a check that invalid input is rejected with 422.</w:t>
       </w:r>
     </w:p>
-    <w:tbl>
-      <w:tblPr>
-        <w:tblStyle w:val="FigureTable"/>
-        <w:tblW w:type="auto" w:w="0"/>
-        <w:jc w:val="center"/>
-        <w:tblLook w:firstRow="0" w:lastRow="0" w:firstColumn="0" w:lastColumn="0"/>
-      </w:tblPr>
-      <w:tblGrid>
-        <w:gridCol w:w="7920"/>
-      </w:tblGrid>
-      <w:tr>
-        <w:tc>
-          <w:tcPr/>
-          <w:p>
-            <w:pPr>
-              <w:pStyle w:val="Compact"/>
-              <w:jc w:val="center"/>
-            </w:pPr>
-            <w:r>
-              <w:t xml:space="preserve">GitHub Actions run</w:t>
-            </w:r>
-          </w:p>
-        </w:tc>
-      </w:tr>
-    </w:tbl>
+    <w:p>
+      <w:pPr>
+        <w:pStyle w:val="CaptionedFigure"/>
+      </w:pPr>
+      <w:r>
+        <w:drawing>
+          <wp:inline>
+            <wp:extent cx="5334000" cy="2363868"/>
+            <wp:effectExtent b="0" l="0" r="0" t="0"/>
+            <wp:docPr descr="GitHub Actions run" title="" id="58" name="Picture"/>
+            <a:graphic>
+              <a:graphicData uri="http://schemas.openxmlformats.org/drawingml/2006/picture">
+                <pic:pic>
+                  <pic:nvPicPr>
+                    <pic:cNvPr descr="../screenshots/github_actions_run.png" id="59" name="Picture"/>
+                    <pic:cNvPicPr>
+                      <a:picLocks noChangeArrowheads="1" noChangeAspect="1"/>
+                    </pic:cNvPicPr>
+                  </pic:nvPicPr>
+                  <pic:blipFill>
+                    <a:blip r:embed="rId57"/>
+                    <a:stretch>
+                      <a:fillRect/>
+                    </a:stretch>
+                  </pic:blipFill>
+                  <pic:spPr bwMode="auto">
+                    <a:xfrm>
+                      <a:off x="0" y="0"/>
+                      <a:ext cx="5334000" cy="2363868"/>
+                    </a:xfrm>
+                    <a:prstGeom prst="rect">
+                      <a:avLst/>
+                    </a:prstGeom>
+                    <a:noFill/>
+                    <a:ln w="9525">
+                      <a:noFill/>
+                      <a:headEnd/>
+                      <a:tailEnd/>
+                    </a:ln>
+                  </pic:spPr>
+                </pic:pic>
+              </a:graphicData>
+            </a:graphic>
+          </wp:inline>
+        </w:drawing>
+      </w:r>
+    </w:p>
     <w:p>
       <w:pPr>
         <w:pStyle w:val="ImageCaption"/>
@@ -4184,31 +4305,53 @@
         <w:t xml:space="preserve">GitHub Actions run</w:t>
       </w:r>
     </w:p>
-    <w:tbl>
-      <w:tblPr>
-        <w:tblStyle w:val="FigureTable"/>
-        <w:tblW w:type="auto" w:w="0"/>
-        <w:jc w:val="center"/>
-        <w:tblLook w:firstRow="0" w:lastRow="0" w:firstColumn="0" w:lastColumn="0"/>
-      </w:tblPr>
-      <w:tblGrid>
-        <w:gridCol w:w="7920"/>
-      </w:tblGrid>
-      <w:tr>
-        <w:tc>
-          <w:tcPr/>
-          <w:p>
-            <w:pPr>
-              <w:pStyle w:val="Compact"/>
-              <w:jc w:val="center"/>
-            </w:pPr>
-            <w:r>
-              <w:t xml:space="preserve">GitHub Actions artifacts</w:t>
-            </w:r>
-          </w:p>
-        </w:tc>
-      </w:tr>
-    </w:tbl>
+    <w:p>
+      <w:pPr>
+        <w:pStyle w:val="CaptionedFigure"/>
+      </w:pPr>
+      <w:r>
+        <w:drawing>
+          <wp:inline>
+            <wp:extent cx="5334000" cy="2651632"/>
+            <wp:effectExtent b="0" l="0" r="0" t="0"/>
+            <wp:docPr descr="GitHub Actions artifacts" title="" id="61" name="Picture"/>
+            <a:graphic>
+              <a:graphicData uri="http://schemas.openxmlformats.org/drawingml/2006/picture">
+                <pic:pic>
+                  <pic:nvPicPr>
+                    <pic:cNvPr descr="../screenshots/github_actions_artifacts.png" id="62" name="Picture"/>
+                    <pic:cNvPicPr>
+                      <a:picLocks noChangeArrowheads="1" noChangeAspect="1"/>
+                    </pic:cNvPicPr>
+                  </pic:nvPicPr>
+                  <pic:blipFill>
+                    <a:blip r:embed="rId60"/>
+                    <a:stretch>
+                      <a:fillRect/>
+                    </a:stretch>
+                  </pic:blipFill>
+                  <pic:spPr bwMode="auto">
+                    <a:xfrm>
+                      <a:off x="0" y="0"/>
+                      <a:ext cx="5334000" cy="2651632"/>
+                    </a:xfrm>
+                    <a:prstGeom prst="rect">
+                      <a:avLst/>
+                    </a:prstGeom>
+                    <a:noFill/>
+                    <a:ln w="9525">
+                      <a:noFill/>
+                      <a:headEnd/>
+                      <a:tailEnd/>
+                    </a:ln>
+                  </pic:spPr>
+                </pic:pic>
+              </a:graphicData>
+            </a:graphic>
+          </wp:inline>
+        </w:drawing>
+      </w:r>
+    </w:p>
     <w:p>
       <w:pPr>
         <w:pStyle w:val="ImageCaption"/>
@@ -4217,9 +4360,9 @@
         <w:t xml:space="preserve">GitHub Actions artifacts</w:t>
       </w:r>
     </w:p>
-    <w:bookmarkEnd w:id="48"/>
-    <w:bookmarkEnd w:id="49"/>
-    <w:bookmarkStart w:id="50" w:name="containerisation"/>
+    <w:bookmarkEnd w:id="63"/>
+    <w:bookmarkEnd w:id="64"/>
+    <w:bookmarkStart w:id="68" w:name="containerisation"/>
     <w:p>
       <w:pPr>
         <w:pStyle w:val="Heading1"/>
@@ -4765,31 +4908,53 @@
         <w:t xml:space="preserve"> "risk_level":"high","model_name":"logistic_regression","request_id":"c764470a9ad4"}</w:t>
       </w:r>
     </w:p>
-    <w:tbl>
-      <w:tblPr>
-        <w:tblStyle w:val="FigureTable"/>
-        <w:tblW w:type="auto" w:w="0"/>
-        <w:jc w:val="center"/>
-        <w:tblLook w:firstRow="0" w:lastRow="0" w:firstColumn="0" w:lastColumn="0"/>
-      </w:tblPr>
-      <w:tblGrid>
-        <w:gridCol w:w="7920"/>
-      </w:tblGrid>
-      <w:tr>
-        <w:tc>
-          <w:tcPr/>
-          <w:p>
-            <w:pPr>
-              <w:pStyle w:val="Compact"/>
-              <w:jc w:val="center"/>
-            </w:pPr>
-            <w:r>
-              <w:t xml:space="preserve">Docker build and run</w:t>
-            </w:r>
-          </w:p>
-        </w:tc>
-      </w:tr>
-    </w:tbl>
+    <w:p>
+      <w:pPr>
+        <w:pStyle w:val="CaptionedFigure"/>
+      </w:pPr>
+      <w:r>
+        <w:drawing>
+          <wp:inline>
+            <wp:extent cx="5334000" cy="926331"/>
+            <wp:effectExtent b="0" l="0" r="0" t="0"/>
+            <wp:docPr descr="Docker build and run" title="" id="66" name="Picture"/>
+            <a:graphic>
+              <a:graphicData uri="http://schemas.openxmlformats.org/drawingml/2006/picture">
+                <pic:pic>
+                  <pic:nvPicPr>
+                    <pic:cNvPr descr="../screenshots/docker_build_run.png" id="67" name="Picture"/>
+                    <pic:cNvPicPr>
+                      <a:picLocks noChangeArrowheads="1" noChangeAspect="1"/>
+                    </pic:cNvPicPr>
+                  </pic:nvPicPr>
+                  <pic:blipFill>
+                    <a:blip r:embed="rId65"/>
+                    <a:stretch>
+                      <a:fillRect/>
+                    </a:stretch>
+                  </pic:blipFill>
+                  <pic:spPr bwMode="auto">
+                    <a:xfrm>
+                      <a:off x="0" y="0"/>
+                      <a:ext cx="5334000" cy="926331"/>
+                    </a:xfrm>
+                    <a:prstGeom prst="rect">
+                      <a:avLst/>
+                    </a:prstGeom>
+                    <a:noFill/>
+                    <a:ln w="9525">
+                      <a:noFill/>
+                      <a:headEnd/>
+                      <a:tailEnd/>
+                    </a:ln>
+                  </pic:spPr>
+                </pic:pic>
+              </a:graphicData>
+            </a:graphic>
+          </wp:inline>
+        </w:drawing>
+      </w:r>
+    </w:p>
     <w:p>
       <w:pPr>
         <w:pStyle w:val="ImageCaption"/>
@@ -4798,8 +4963,8 @@
         <w:t xml:space="preserve">Docker build and run</w:t>
       </w:r>
     </w:p>
-    <w:bookmarkEnd w:id="50"/>
-    <w:bookmarkStart w:id="51" w:name="production-deployment-kubernetes"/>
+    <w:bookmarkEnd w:id="68"/>
+    <w:bookmarkStart w:id="78" w:name="production-deployment-kubernetes"/>
     <w:p>
       <w:pPr>
         <w:pStyle w:val="Heading1"/>
@@ -5049,34 +5214,56 @@
         <w:rPr>
           <w:rStyle w:val="VerbatimChar"/>
         </w:rPr>
-        <w:t xml:space="preserve">python scripts/smoke_test.py --url http://localhost</w:t>
-      </w:r>
-    </w:p>
-    <w:tbl>
-      <w:tblPr>
-        <w:tblStyle w:val="FigureTable"/>
-        <w:tblW w:type="auto" w:w="0"/>
-        <w:jc w:val="center"/>
-        <w:tblLook w:firstRow="0" w:lastRow="0" w:firstColumn="0" w:lastColumn="0"/>
-      </w:tblPr>
-      <w:tblGrid>
-        <w:gridCol w:w="7920"/>
-      </w:tblGrid>
-      <w:tr>
-        <w:tc>
-          <w:tcPr/>
-          <w:p>
-            <w:pPr>
-              <w:pStyle w:val="Compact"/>
-              <w:jc w:val="center"/>
-            </w:pPr>
-            <w:r>
-              <w:t xml:space="preserve">kubectl get pods,svc</w:t>
-            </w:r>
-          </w:p>
-        </w:tc>
-      </w:tr>
-    </w:tbl>
+        <w:t xml:space="preserve">python scripts/smoke_test.py --url http://127.0.0.1</w:t>
+      </w:r>
+    </w:p>
+    <w:p>
+      <w:pPr>
+        <w:pStyle w:val="CaptionedFigure"/>
+      </w:pPr>
+      <w:r>
+        <w:drawing>
+          <wp:inline>
+            <wp:extent cx="5334000" cy="1794123"/>
+            <wp:effectExtent b="0" l="0" r="0" t="0"/>
+            <wp:docPr descr="kubectl get pods,svc" title="" id="70" name="Picture"/>
+            <a:graphic>
+              <a:graphicData uri="http://schemas.openxmlformats.org/drawingml/2006/picture">
+                <pic:pic>
+                  <pic:nvPicPr>
+                    <pic:cNvPr descr="../screenshots/k8s_pods_services.png" id="71" name="Picture"/>
+                    <pic:cNvPicPr>
+                      <a:picLocks noChangeArrowheads="1" noChangeAspect="1"/>
+                    </pic:cNvPicPr>
+                  </pic:nvPicPr>
+                  <pic:blipFill>
+                    <a:blip r:embed="rId69"/>
+                    <a:stretch>
+                      <a:fillRect/>
+                    </a:stretch>
+                  </pic:blipFill>
+                  <pic:spPr bwMode="auto">
+                    <a:xfrm>
+                      <a:off x="0" y="0"/>
+                      <a:ext cx="5334000" cy="1794123"/>
+                    </a:xfrm>
+                    <a:prstGeom prst="rect">
+                      <a:avLst/>
+                    </a:prstGeom>
+                    <a:noFill/>
+                    <a:ln w="9525">
+                      <a:noFill/>
+                      <a:headEnd/>
+                      <a:tailEnd/>
+                    </a:ln>
+                  </pic:spPr>
+                </pic:pic>
+              </a:graphicData>
+            </a:graphic>
+          </wp:inline>
+        </w:drawing>
+      </w:r>
+    </w:p>
     <w:p>
       <w:pPr>
         <w:pStyle w:val="ImageCaption"/>
@@ -5085,41 +5272,118 @@
         <w:t xml:space="preserve">kubectl get pods,svc</w:t>
       </w:r>
     </w:p>
-    <w:tbl>
-      <w:tblPr>
-        <w:tblStyle w:val="FigureTable"/>
-        <w:tblW w:type="auto" w:w="0"/>
-        <w:jc w:val="center"/>
-        <w:tblLook w:firstRow="0" w:lastRow="0" w:firstColumn="0" w:lastColumn="0"/>
-      </w:tblPr>
-      <w:tblGrid>
-        <w:gridCol w:w="7920"/>
-      </w:tblGrid>
-      <w:tr>
-        <w:tc>
-          <w:tcPr/>
-          <w:p>
-            <w:pPr>
-              <w:pStyle w:val="Compact"/>
-              <w:jc w:val="center"/>
-            </w:pPr>
-            <w:r>
-              <w:t xml:space="preserve">Prediction through the LoadBalancer</w:t>
-            </w:r>
-          </w:p>
-        </w:tc>
-      </w:tr>
-    </w:tbl>
+    <w:p>
+      <w:pPr>
+        <w:pStyle w:val="CaptionedFigure"/>
+      </w:pPr>
+      <w:r>
+        <w:drawing>
+          <wp:inline>
+            <wp:extent cx="5334000" cy="3123087"/>
+            <wp:effectExtent b="0" l="0" r="0" t="0"/>
+            <wp:docPr descr="Docker Desktop Kubernetes view (namespace heart-mlops)" title="" id="73" name="Picture"/>
+            <a:graphic>
+              <a:graphicData uri="http://schemas.openxmlformats.org/drawingml/2006/picture">
+                <pic:pic>
+                  <pic:nvPicPr>
+                    <pic:cNvPr descr="../screenshots/docker_desktop_k8s.png" id="74" name="Picture"/>
+                    <pic:cNvPicPr>
+                      <a:picLocks noChangeArrowheads="1" noChangeAspect="1"/>
+                    </pic:cNvPicPr>
+                  </pic:nvPicPr>
+                  <pic:blipFill>
+                    <a:blip r:embed="rId72"/>
+                    <a:stretch>
+                      <a:fillRect/>
+                    </a:stretch>
+                  </pic:blipFill>
+                  <pic:spPr bwMode="auto">
+                    <a:xfrm>
+                      <a:off x="0" y="0"/>
+                      <a:ext cx="5334000" cy="3123087"/>
+                    </a:xfrm>
+                    <a:prstGeom prst="rect">
+                      <a:avLst/>
+                    </a:prstGeom>
+                    <a:noFill/>
+                    <a:ln w="9525">
+                      <a:noFill/>
+                      <a:headEnd/>
+                      <a:tailEnd/>
+                    </a:ln>
+                  </pic:spPr>
+                </pic:pic>
+              </a:graphicData>
+            </a:graphic>
+          </wp:inline>
+        </w:drawing>
+      </w:r>
+    </w:p>
     <w:p>
       <w:pPr>
         <w:pStyle w:val="ImageCaption"/>
       </w:pPr>
       <w:r>
-        <w:t xml:space="preserve">Prediction through the LoadBalancer</w:t>
-      </w:r>
-    </w:p>
-    <w:bookmarkEnd w:id="51"/>
-    <w:bookmarkStart w:id="52" w:name="monitoring-and-logging"/>
+        <w:t xml:space="preserve">Docker Desktop Kubernetes view (namespace heart-mlops)</w:t>
+      </w:r>
+    </w:p>
+    <w:p>
+      <w:pPr>
+        <w:pStyle w:val="CaptionedFigure"/>
+      </w:pPr>
+      <w:r>
+        <w:drawing>
+          <wp:inline>
+            <wp:extent cx="5334000" cy="3063728"/>
+            <wp:effectExtent b="0" l="0" r="0" t="0"/>
+            <wp:docPr descr="Smoke test through the LoadBalancer, followed by the pods’ JSON request logs" title="" id="76" name="Picture"/>
+            <a:graphic>
+              <a:graphicData uri="http://schemas.openxmlformats.org/drawingml/2006/picture">
+                <pic:pic>
+                  <pic:nvPicPr>
+                    <pic:cNvPr descr="../screenshots/k8s_predict.png" id="77" name="Picture"/>
+                    <pic:cNvPicPr>
+                      <a:picLocks noChangeArrowheads="1" noChangeAspect="1"/>
+                    </pic:cNvPicPr>
+                  </pic:nvPicPr>
+                  <pic:blipFill>
+                    <a:blip r:embed="rId75"/>
+                    <a:stretch>
+                      <a:fillRect/>
+                    </a:stretch>
+                  </pic:blipFill>
+                  <pic:spPr bwMode="auto">
+                    <a:xfrm>
+                      <a:off x="0" y="0"/>
+                      <a:ext cx="5334000" cy="3063728"/>
+                    </a:xfrm>
+                    <a:prstGeom prst="rect">
+                      <a:avLst/>
+                    </a:prstGeom>
+                    <a:noFill/>
+                    <a:ln w="9525">
+                      <a:noFill/>
+                      <a:headEnd/>
+                      <a:tailEnd/>
+                    </a:ln>
+                  </pic:spPr>
+                </pic:pic>
+              </a:graphicData>
+            </a:graphic>
+          </wp:inline>
+        </w:drawing>
+      </w:r>
+    </w:p>
+    <w:p>
+      <w:pPr>
+        <w:pStyle w:val="ImageCaption"/>
+      </w:pPr>
+      <w:r>
+        <w:t xml:space="preserve">Smoke test through the LoadBalancer, followed by the pods’ JSON request logs</w:t>
+      </w:r>
+    </w:p>
+    <w:bookmarkEnd w:id="78"/>
+    <w:bookmarkStart w:id="88" w:name="monitoring-and-logging"/>
     <w:p>
       <w:pPr>
         <w:pStyle w:val="Heading1"/>
@@ -5575,107 +5839,173 @@
         <w:t xml:space="preserve">same stack without Kubernetes.</w:t>
       </w:r>
     </w:p>
-    <w:tbl>
-      <w:tblPr>
-        <w:tblStyle w:val="FigureTable"/>
-        <w:tblW w:type="auto" w:w="0"/>
-        <w:jc w:val="center"/>
-        <w:tblLook w:firstRow="0" w:lastRow="0" w:firstColumn="0" w:lastColumn="0"/>
-      </w:tblPr>
-      <w:tblGrid>
-        <w:gridCol w:w="7920"/>
-      </w:tblGrid>
-      <w:tr>
-        <w:tc>
-          <w:tcPr/>
-          <w:p>
-            <w:pPr>
-              <w:pStyle w:val="Compact"/>
-              <w:jc w:val="center"/>
-            </w:pPr>
-            <w:r>
-              <w:t xml:space="preserve">Grafana dashboard</w:t>
-            </w:r>
-          </w:p>
-        </w:tc>
-      </w:tr>
-    </w:tbl>
+    <w:p>
+      <w:pPr>
+        <w:pStyle w:val="CaptionedFigure"/>
+      </w:pPr>
+      <w:r>
+        <w:drawing>
+          <wp:inline>
+            <wp:extent cx="5334000" cy="2646131"/>
+            <wp:effectExtent b="0" l="0" r="0" t="0"/>
+            <wp:docPr descr="Grafana dashboard: status, throughput and latency" title="" id="80" name="Picture"/>
+            <a:graphic>
+              <a:graphicData uri="http://schemas.openxmlformats.org/drawingml/2006/picture">
+                <pic:pic>
+                  <pic:nvPicPr>
+                    <pic:cNvPr descr="../screenshots/grafana_dashboard.png" id="81" name="Picture"/>
+                    <pic:cNvPicPr>
+                      <a:picLocks noChangeArrowheads="1" noChangeAspect="1"/>
+                    </pic:cNvPicPr>
+                  </pic:nvPicPr>
+                  <pic:blipFill>
+                    <a:blip r:embed="rId79"/>
+                    <a:stretch>
+                      <a:fillRect/>
+                    </a:stretch>
+                  </pic:blipFill>
+                  <pic:spPr bwMode="auto">
+                    <a:xfrm>
+                      <a:off x="0" y="0"/>
+                      <a:ext cx="5334000" cy="2646131"/>
+                    </a:xfrm>
+                    <a:prstGeom prst="rect">
+                      <a:avLst/>
+                    </a:prstGeom>
+                    <a:noFill/>
+                    <a:ln w="9525">
+                      <a:noFill/>
+                      <a:headEnd/>
+                      <a:tailEnd/>
+                    </a:ln>
+                  </pic:spPr>
+                </pic:pic>
+              </a:graphicData>
+            </a:graphic>
+          </wp:inline>
+        </w:drawing>
+      </w:r>
+    </w:p>
     <w:p>
       <w:pPr>
         <w:pStyle w:val="ImageCaption"/>
       </w:pPr>
       <w:r>
-        <w:t xml:space="preserve">Grafana dashboard</w:t>
-      </w:r>
-    </w:p>
-    <w:tbl>
-      <w:tblPr>
-        <w:tblStyle w:val="FigureTable"/>
-        <w:tblW w:type="auto" w:w="0"/>
-        <w:jc w:val="center"/>
-        <w:tblLook w:firstRow="0" w:lastRow="0" w:firstColumn="0" w:lastColumn="0"/>
-      </w:tblPr>
-      <w:tblGrid>
-        <w:gridCol w:w="7920"/>
-      </w:tblGrid>
-      <w:tr>
-        <w:tc>
-          <w:tcPr/>
-          <w:p>
-            <w:pPr>
-              <w:pStyle w:val="Compact"/>
-              <w:jc w:val="center"/>
-            </w:pPr>
-            <w:r>
-              <w:t xml:space="preserve">Prometheus targets</w:t>
-            </w:r>
-          </w:p>
-        </w:tc>
-      </w:tr>
-    </w:tbl>
+        <w:t xml:space="preserve">Grafana dashboard: status, throughput and latency</w:t>
+      </w:r>
+    </w:p>
+    <w:p>
+      <w:pPr>
+        <w:pStyle w:val="CaptionedFigure"/>
+      </w:pPr>
+      <w:r>
+        <w:drawing>
+          <wp:inline>
+            <wp:extent cx="5334000" cy="2639189"/>
+            <wp:effectExtent b="0" l="0" r="0" t="0"/>
+            <wp:docPr descr="Grafana dashboard: class mix, probability distribution and response codes" title="" id="83" name="Picture"/>
+            <a:graphic>
+              <a:graphicData uri="http://schemas.openxmlformats.org/drawingml/2006/picture">
+                <pic:pic>
+                  <pic:nvPicPr>
+                    <pic:cNvPr descr="../screenshots/grafana_dashboard_2.png" id="84" name="Picture"/>
+                    <pic:cNvPicPr>
+                      <a:picLocks noChangeArrowheads="1" noChangeAspect="1"/>
+                    </pic:cNvPicPr>
+                  </pic:nvPicPr>
+                  <pic:blipFill>
+                    <a:blip r:embed="rId82"/>
+                    <a:stretch>
+                      <a:fillRect/>
+                    </a:stretch>
+                  </pic:blipFill>
+                  <pic:spPr bwMode="auto">
+                    <a:xfrm>
+                      <a:off x="0" y="0"/>
+                      <a:ext cx="5334000" cy="2639189"/>
+                    </a:xfrm>
+                    <a:prstGeom prst="rect">
+                      <a:avLst/>
+                    </a:prstGeom>
+                    <a:noFill/>
+                    <a:ln w="9525">
+                      <a:noFill/>
+                      <a:headEnd/>
+                      <a:tailEnd/>
+                    </a:ln>
+                  </pic:spPr>
+                </pic:pic>
+              </a:graphicData>
+            </a:graphic>
+          </wp:inline>
+        </w:drawing>
+      </w:r>
+    </w:p>
     <w:p>
       <w:pPr>
         <w:pStyle w:val="ImageCaption"/>
       </w:pPr>
       <w:r>
+        <w:t xml:space="preserve">Grafana dashboard: class mix, probability distribution and response codes</w:t>
+      </w:r>
+    </w:p>
+    <w:p>
+      <w:pPr>
+        <w:pStyle w:val="CaptionedFigure"/>
+      </w:pPr>
+      <w:r>
+        <w:drawing>
+          <wp:inline>
+            <wp:extent cx="5334000" cy="2380554"/>
+            <wp:effectExtent b="0" l="0" r="0" t="0"/>
+            <wp:docPr descr="Prometheus targets" title="" id="86" name="Picture"/>
+            <a:graphic>
+              <a:graphicData uri="http://schemas.openxmlformats.org/drawingml/2006/picture">
+                <pic:pic>
+                  <pic:nvPicPr>
+                    <pic:cNvPr descr="../screenshots/prometheus_targets.png" id="87" name="Picture"/>
+                    <pic:cNvPicPr>
+                      <a:picLocks noChangeArrowheads="1" noChangeAspect="1"/>
+                    </pic:cNvPicPr>
+                  </pic:nvPicPr>
+                  <pic:blipFill>
+                    <a:blip r:embed="rId85"/>
+                    <a:stretch>
+                      <a:fillRect/>
+                    </a:stretch>
+                  </pic:blipFill>
+                  <pic:spPr bwMode="auto">
+                    <a:xfrm>
+                      <a:off x="0" y="0"/>
+                      <a:ext cx="5334000" cy="2380554"/>
+                    </a:xfrm>
+                    <a:prstGeom prst="rect">
+                      <a:avLst/>
+                    </a:prstGeom>
+                    <a:noFill/>
+                    <a:ln w="9525">
+                      <a:noFill/>
+                      <a:headEnd/>
+                      <a:tailEnd/>
+                    </a:ln>
+                  </pic:spPr>
+                </pic:pic>
+              </a:graphicData>
+            </a:graphic>
+          </wp:inline>
+        </w:drawing>
+      </w:r>
+    </w:p>
+    <w:p>
+      <w:pPr>
+        <w:pStyle w:val="ImageCaption"/>
+      </w:pPr>
+      <w:r>
         <w:t xml:space="preserve">Prometheus targets</w:t>
       </w:r>
     </w:p>
-    <w:tbl>
-      <w:tblPr>
-        <w:tblStyle w:val="FigureTable"/>
-        <w:tblW w:type="auto" w:w="0"/>
-        <w:jc w:val="center"/>
-        <w:tblLook w:firstRow="0" w:lastRow="0" w:firstColumn="0" w:lastColumn="0"/>
-      </w:tblPr>
-      <w:tblGrid>
-        <w:gridCol w:w="7920"/>
-      </w:tblGrid>
-      <w:tr>
-        <w:tc>
-          <w:tcPr/>
-          <w:p>
-            <w:pPr>
-              <w:pStyle w:val="Compact"/>
-              <w:jc w:val="center"/>
-            </w:pPr>
-            <w:r>
-              <w:t xml:space="preserve">Structured API logs</w:t>
-            </w:r>
-          </w:p>
-        </w:tc>
-      </w:tr>
-    </w:tbl>
-    <w:p>
-      <w:pPr>
-        <w:pStyle w:val="ImageCaption"/>
-      </w:pPr>
-      <w:r>
-        <w:t xml:space="preserve">Structured API logs</w:t>
-      </w:r>
-    </w:p>
-    <w:bookmarkEnd w:id="52"/>
-    <w:bookmarkStart w:id="53" w:name="limitations-and-next-steps"/>
+    <w:bookmarkEnd w:id="88"/>
+    <w:bookmarkStart w:id="89" w:name="limitations-and-next-steps"/>
     <w:p>
       <w:pPr>
         <w:pStyle w:val="Heading1"/>
@@ -5832,8 +6162,8 @@
         <w:t xml:space="preserve">with Evidently.</w:t>
       </w:r>
     </w:p>
-    <w:bookmarkEnd w:id="53"/>
-    <w:bookmarkStart w:id="54" w:name="deliverables-checklist"/>
+    <w:bookmarkEnd w:id="89"/>
+    <w:bookmarkStart w:id="90" w:name="deliverables-checklist"/>
     <w:p>
       <w:pPr>
         <w:pStyle w:val="Heading1"/>
@@ -6331,7 +6661,7 @@
         </w:tc>
       </w:tr>
     </w:tbl>
-    <w:bookmarkEnd w:id="54"/>
+    <w:bookmarkEnd w:id="90"/>
     <w:sectPr>
       <w:footnotePr>
         <w:numRestart w:val="eachSect"/>

</xml_diff>

<commit_message>
Add author details to report
</commit_message>
<xml_diff>
--- a/reports/REPORT.docx
+++ b/reports/REPORT.docx
@@ -23,13 +23,7 @@
         <w:pStyle w:val="Author"/>
       </w:pPr>
       <w:r>
-        <w:t xml:space="preserve"> </w:t>
-      </w:r>
-      <w:r>
-        <w:t xml:space="preserve">(</w:t>
-      </w:r>
-      <w:r>
-        <w:t xml:space="preserve">)</w:t>
+        <w:t xml:space="preserve">Aboli Shantinath Jangde (2025AE05702)</w:t>
       </w:r>
     </w:p>
     <w:p>

</xml_diff>

<commit_message>
Add demo video link
</commit_message>
<xml_diff>
--- a/reports/REPORT.docx
+++ b/reports/REPORT.docx
@@ -97,11 +97,16 @@
       <w:r>
         <w:t xml:space="preserve"> </w:t>
       </w:r>
-      <w:r>
-        <w:t xml:space="preserve">submitted alongside this report (pipeline_demo.mp4)</w:t>
-      </w:r>
-    </w:p>
-    <w:bookmarkStart w:id="13" w:name="overview"/>
+      <w:hyperlink r:id="rId10">
+        <w:r>
+          <w:rPr>
+            <w:rStyle w:val="Hyperlink"/>
+          </w:rPr>
+          <w:t xml:space="preserve">https://drive.google.com/file/d/1WlXAq1oL3a1b55fZwh8xyEHOZH3uWLNT/view?usp=drive_link</w:t>
+        </w:r>
+      </w:hyperlink>
+    </w:p>
+    <w:bookmarkStart w:id="14" w:name="overview"/>
     <w:p>
       <w:pPr>
         <w:pStyle w:val="Heading1"/>
@@ -316,18 +321,18 @@
           <wp:inline>
             <wp:extent cx="5334000" cy="3036276"/>
             <wp:effectExtent b="0" l="0" r="0" t="0"/>
-            <wp:docPr descr="Architecture" title="" id="11" name="Picture"/>
+            <wp:docPr descr="Architecture" title="" id="12" name="Picture"/>
             <a:graphic>
               <a:graphicData uri="http://schemas.openxmlformats.org/drawingml/2006/picture">
                 <pic:pic>
                   <pic:nvPicPr>
-                    <pic:cNvPr descr="figures/architecture.png" id="12" name="Picture"/>
+                    <pic:cNvPr descr="figures/architecture.png" id="13" name="Picture"/>
                     <pic:cNvPicPr>
                       <a:picLocks noChangeArrowheads="1" noChangeAspect="1"/>
                     </pic:cNvPicPr>
                   </pic:nvPicPr>
                   <pic:blipFill>
-                    <a:blip r:embed="rId10"/>
+                    <a:blip r:embed="rId11"/>
                     <a:stretch>
                       <a:fillRect/>
                     </a:stretch>
@@ -374,8 +379,8 @@
         <w:t xml:space="preserve">Figure 1: System architecture.</w:t>
       </w:r>
     </w:p>
-    <w:bookmarkEnd w:id="13"/>
-    <w:bookmarkStart w:id="14" w:name="setup-and-installation"/>
+    <w:bookmarkEnd w:id="14"/>
+    <w:bookmarkStart w:id="15" w:name="setup-and-installation"/>
     <w:p>
       <w:pPr>
         <w:pStyle w:val="Heading1"/>
@@ -775,8 +780,8 @@
         </w:tc>
       </w:tr>
     </w:tbl>
-    <w:bookmarkEnd w:id="14"/>
-    <w:bookmarkStart w:id="30" w:name="data-acquisition-and-eda"/>
+    <w:bookmarkEnd w:id="15"/>
+    <w:bookmarkStart w:id="31" w:name="data-acquisition-and-eda"/>
     <w:p>
       <w:pPr>
         <w:pStyle w:val="Heading1"/>
@@ -785,7 +790,7 @@
         <w:t xml:space="preserve">3. Data acquisition and EDA</w:t>
       </w:r>
     </w:p>
-    <w:bookmarkStart w:id="15" w:name="acquisition"/>
+    <w:bookmarkStart w:id="16" w:name="acquisition"/>
     <w:p>
       <w:pPr>
         <w:pStyle w:val="Heading2"/>
@@ -871,8 +876,8 @@
         <w:t xml:space="preserve">13 features and the target.</w:t>
       </w:r>
     </w:p>
-    <w:bookmarkEnd w:id="15"/>
-    <w:bookmarkStart w:id="16" w:name="cleaning-decisions"/>
+    <w:bookmarkEnd w:id="16"/>
+    <w:bookmarkStart w:id="17" w:name="cleaning-decisions"/>
     <w:p>
       <w:pPr>
         <w:pStyle w:val="Heading2"/>
@@ -1163,8 +1168,8 @@
         </w:tc>
       </w:tr>
     </w:tbl>
-    <w:bookmarkEnd w:id="16"/>
-    <w:bookmarkStart w:id="29" w:name="findings"/>
+    <w:bookmarkEnd w:id="17"/>
+    <w:bookmarkStart w:id="30" w:name="findings"/>
     <w:p>
       <w:pPr>
         <w:pStyle w:val="Heading2"/>
@@ -1434,18 +1439,18 @@
           <wp:inline>
             <wp:extent cx="2400300" cy="1920240"/>
             <wp:effectExtent b="0" l="0" r="0" t="0"/>
-            <wp:docPr descr="Class balance" title="" id="18" name="Picture"/>
+            <wp:docPr descr="Class balance" title="" id="19" name="Picture"/>
             <a:graphic>
               <a:graphicData uri="http://schemas.openxmlformats.org/drawingml/2006/picture">
                 <pic:pic>
                   <pic:nvPicPr>
-                    <pic:cNvPr descr="figures/class_balance.png" id="19" name="Picture"/>
+                    <pic:cNvPr descr="figures/class_balance.png" id="20" name="Picture"/>
                     <pic:cNvPicPr>
                       <a:picLocks noChangeArrowheads="1" noChangeAspect="1"/>
                     </pic:cNvPicPr>
                   </pic:nvPicPr>
                   <pic:blipFill>
-                    <a:blip r:embed="rId17"/>
+                    <a:blip r:embed="rId18"/>
                     <a:stretch>
                       <a:fillRect/>
                     </a:stretch>
@@ -1489,18 +1494,18 @@
           <wp:inline>
             <wp:extent cx="5334000" cy="960120"/>
             <wp:effectExtent b="0" l="0" r="0" t="0"/>
-            <wp:docPr descr="Numeric distributions" title="" id="21" name="Picture"/>
+            <wp:docPr descr="Numeric distributions" title="" id="22" name="Picture"/>
             <a:graphic>
               <a:graphicData uri="http://schemas.openxmlformats.org/drawingml/2006/picture">
                 <pic:pic>
                   <pic:nvPicPr>
-                    <pic:cNvPr descr="figures/numeric_histograms.png" id="22" name="Picture"/>
+                    <pic:cNvPr descr="figures/numeric_histograms.png" id="23" name="Picture"/>
                     <pic:cNvPicPr>
                       <a:picLocks noChangeArrowheads="1" noChangeAspect="1"/>
                     </pic:cNvPicPr>
                   </pic:nvPicPr>
                   <pic:blipFill>
-                    <a:blip r:embed="rId20"/>
+                    <a:blip r:embed="rId21"/>
                     <a:stretch>
                       <a:fillRect/>
                     </a:stretch>
@@ -1544,18 +1549,18 @@
           <wp:inline>
             <wp:extent cx="5334000" cy="2200275"/>
             <wp:effectExtent b="0" l="0" r="0" t="0"/>
-            <wp:docPr descr="Disease rate per category" title="" id="24" name="Picture"/>
+            <wp:docPr descr="Disease rate per category" title="" id="25" name="Picture"/>
             <a:graphic>
               <a:graphicData uri="http://schemas.openxmlformats.org/drawingml/2006/picture">
                 <pic:pic>
                   <pic:nvPicPr>
-                    <pic:cNvPr descr="figures/categorical_disease_rate.png" id="25" name="Picture"/>
+                    <pic:cNvPr descr="figures/categorical_disease_rate.png" id="26" name="Picture"/>
                     <pic:cNvPicPr>
                       <a:picLocks noChangeArrowheads="1" noChangeAspect="1"/>
                     </pic:cNvPicPr>
                   </pic:nvPicPr>
                   <pic:blipFill>
-                    <a:blip r:embed="rId23"/>
+                    <a:blip r:embed="rId24"/>
                     <a:stretch>
                       <a:fillRect/>
                     </a:stretch>
@@ -1599,18 +1604,18 @@
           <wp:inline>
             <wp:extent cx="4267200" cy="3413760"/>
             <wp:effectExtent b="0" l="0" r="0" t="0"/>
-            <wp:docPr descr="Correlation heatmap" title="" id="27" name="Picture"/>
+            <wp:docPr descr="Correlation heatmap" title="" id="28" name="Picture"/>
             <a:graphic>
               <a:graphicData uri="http://schemas.openxmlformats.org/drawingml/2006/picture">
                 <pic:pic>
                   <pic:nvPicPr>
-                    <pic:cNvPr descr="figures/correlation_heatmap.png" id="28" name="Picture"/>
+                    <pic:cNvPr descr="figures/correlation_heatmap.png" id="29" name="Picture"/>
                     <pic:cNvPicPr>
                       <a:picLocks noChangeArrowheads="1" noChangeAspect="1"/>
                     </pic:cNvPicPr>
                   </pic:nvPicPr>
                   <pic:blipFill>
-                    <a:blip r:embed="rId26"/>
+                    <a:blip r:embed="rId27"/>
                     <a:stretch>
                       <a:fillRect/>
                     </a:stretch>
@@ -1645,9 +1650,9 @@
         <w:t xml:space="preserve">Correlation heatmap</w:t>
       </w:r>
     </w:p>
-    <w:bookmarkEnd w:id="29"/>
     <w:bookmarkEnd w:id="30"/>
-    <w:bookmarkStart w:id="43" w:name="Xa799d93673afa10bf90c9043574061a98caadb1"/>
+    <w:bookmarkEnd w:id="31"/>
+    <w:bookmarkStart w:id="44" w:name="Xa799d93673afa10bf90c9043574061a98caadb1"/>
     <w:p>
       <w:pPr>
         <w:pStyle w:val="Heading1"/>
@@ -1656,7 +1661,7 @@
         <w:t xml:space="preserve">4. Feature engineering and model development</w:t>
       </w:r>
     </w:p>
-    <w:bookmarkStart w:id="31" w:name="preprocessing-heartmlfeatures.py"/>
+    <w:bookmarkStart w:id="32" w:name="preprocessing-heartmlfeatures.py"/>
     <w:p>
       <w:pPr>
         <w:pStyle w:val="Heading2"/>
@@ -1934,8 +1939,8 @@
         <w:t xml:space="preserve">so this is a second line of defence.</w:t>
       </w:r>
     </w:p>
-    <w:bookmarkEnd w:id="31"/>
-    <w:bookmarkStart w:id="32" w:name="models-and-tuning"/>
+    <w:bookmarkEnd w:id="32"/>
+    <w:bookmarkStart w:id="33" w:name="models-and-tuning"/>
     <w:p>
       <w:pPr>
         <w:pStyle w:val="Heading2"/>
@@ -2238,8 +2243,8 @@
         <w:t xml:space="preserve">ensembles buys nothing.</w:t>
       </w:r>
     </w:p>
-    <w:bookmarkEnd w:id="32"/>
-    <w:bookmarkStart w:id="42" w:name="results"/>
+    <w:bookmarkEnd w:id="33"/>
+    <w:bookmarkStart w:id="43" w:name="results"/>
     <w:p>
       <w:pPr>
         <w:pStyle w:val="Heading2"/>
@@ -2786,18 +2791,18 @@
           <wp:inline>
             <wp:extent cx="2400300" cy="2133600"/>
             <wp:effectExtent b="0" l="0" r="0" t="0"/>
-            <wp:docPr descr="LR ROC" title="" id="34" name="Picture"/>
+            <wp:docPr descr="LR ROC" title="" id="35" name="Picture"/>
             <a:graphic>
               <a:graphicData uri="http://schemas.openxmlformats.org/drawingml/2006/picture">
                 <pic:pic>
                   <pic:nvPicPr>
-                    <pic:cNvPr descr="model_plots/logistic_regression_roc_curve.png" id="35" name="Picture"/>
+                    <pic:cNvPr descr="model_plots/logistic_regression_roc_curve.png" id="36" name="Picture"/>
                     <pic:cNvPicPr>
                       <a:picLocks noChangeArrowheads="1" noChangeAspect="1"/>
                     </pic:cNvPicPr>
                   </pic:nvPicPr>
                   <pic:blipFill>
-                    <a:blip r:embed="rId33"/>
+                    <a:blip r:embed="rId34"/>
                     <a:stretch>
                       <a:fillRect/>
                     </a:stretch>
@@ -2831,18 +2836,18 @@
           <wp:inline>
             <wp:extent cx="2400300" cy="2133600"/>
             <wp:effectExtent b="0" l="0" r="0" t="0"/>
-            <wp:docPr descr="LR confusion matrix" title="" id="37" name="Picture"/>
+            <wp:docPr descr="LR confusion matrix" title="" id="38" name="Picture"/>
             <a:graphic>
               <a:graphicData uri="http://schemas.openxmlformats.org/drawingml/2006/picture">
                 <pic:pic>
                   <pic:nvPicPr>
-                    <pic:cNvPr descr="model_plots/logistic_regression_confusion_matrix.png" id="38" name="Picture"/>
+                    <pic:cNvPr descr="model_plots/logistic_regression_confusion_matrix.png" id="39" name="Picture"/>
                     <pic:cNvPicPr>
                       <a:picLocks noChangeArrowheads="1" noChangeAspect="1"/>
                     </pic:cNvPicPr>
                   </pic:nvPicPr>
                   <pic:blipFill>
-                    <a:blip r:embed="rId36"/>
+                    <a:blip r:embed="rId37"/>
                     <a:stretch>
                       <a:fillRect/>
                     </a:stretch>
@@ -2878,18 +2883,18 @@
           <wp:inline>
             <wp:extent cx="3200400" cy="2909454"/>
             <wp:effectExtent b="0" l="0" r="0" t="0"/>
-            <wp:docPr descr="LR coefficient magnitudes" title="" id="40" name="Picture"/>
+            <wp:docPr descr="LR coefficient magnitudes" title="" id="41" name="Picture"/>
             <a:graphic>
               <a:graphicData uri="http://schemas.openxmlformats.org/drawingml/2006/picture">
                 <pic:pic>
                   <pic:nvPicPr>
-                    <pic:cNvPr descr="model_plots/logistic_regression_feature_importance.png" id="41" name="Picture"/>
+                    <pic:cNvPr descr="model_plots/logistic_regression_feature_importance.png" id="42" name="Picture"/>
                     <pic:cNvPicPr>
                       <a:picLocks noChangeArrowheads="1" noChangeAspect="1"/>
                     </pic:cNvPicPr>
                   </pic:nvPicPr>
                   <pic:blipFill>
-                    <a:blip r:embed="rId39"/>
+                    <a:blip r:embed="rId40"/>
                     <a:stretch>
                       <a:fillRect/>
                     </a:stretch>
@@ -2924,9 +2929,9 @@
         <w:t xml:space="preserve">LR coefficient magnitudes</w:t>
       </w:r>
     </w:p>
-    <w:bookmarkEnd w:id="42"/>
     <w:bookmarkEnd w:id="43"/>
-    <w:bookmarkStart w:id="54" w:name="experiment-tracking-mlflow"/>
+    <w:bookmarkEnd w:id="44"/>
+    <w:bookmarkStart w:id="55" w:name="experiment-tracking-mlflow"/>
     <w:p>
       <w:pPr>
         <w:pStyle w:val="Heading1"/>
@@ -3225,7 +3230,7 @@
       <w:r>
         <w:t xml:space="preserve"> </w:t>
       </w:r>
-      <w:hyperlink r:id="rId44">
+      <w:hyperlink r:id="rId45">
         <w:r>
           <w:rPr>
             <w:rStyle w:val="Hyperlink"/>
@@ -3246,18 +3251,18 @@
           <wp:inline>
             <wp:extent cx="5334000" cy="3339459"/>
             <wp:effectExtent b="0" l="0" r="0" t="0"/>
-            <wp:docPr descr="MLflow runs" title="" id="46" name="Picture"/>
+            <wp:docPr descr="MLflow runs" title="" id="47" name="Picture"/>
             <a:graphic>
               <a:graphicData uri="http://schemas.openxmlformats.org/drawingml/2006/picture">
                 <pic:pic>
                   <pic:nvPicPr>
-                    <pic:cNvPr descr="../screenshots/mlflow_runs.png" id="47" name="Picture"/>
+                    <pic:cNvPr descr="../screenshots/mlflow_runs.png" id="48" name="Picture"/>
                     <pic:cNvPicPr>
                       <a:picLocks noChangeArrowheads="1" noChangeAspect="1"/>
                     </pic:cNvPicPr>
                   </pic:nvPicPr>
                   <pic:blipFill>
-                    <a:blip r:embed="rId45"/>
+                    <a:blip r:embed="rId46"/>
                     <a:stretch>
                       <a:fillRect/>
                     </a:stretch>
@@ -3301,18 +3306,18 @@
           <wp:inline>
             <wp:extent cx="5334000" cy="2812523"/>
             <wp:effectExtent b="0" l="0" r="0" t="0"/>
-            <wp:docPr descr="MLflow run detail" title="" id="49" name="Picture"/>
+            <wp:docPr descr="MLflow run detail" title="" id="50" name="Picture"/>
             <a:graphic>
               <a:graphicData uri="http://schemas.openxmlformats.org/drawingml/2006/picture">
                 <pic:pic>
                   <pic:nvPicPr>
-                    <pic:cNvPr descr="../screenshots/mlflow_run_detail.png" id="50" name="Picture"/>
+                    <pic:cNvPr descr="../screenshots/mlflow_run_detail.png" id="51" name="Picture"/>
                     <pic:cNvPicPr>
                       <a:picLocks noChangeArrowheads="1" noChangeAspect="1"/>
                     </pic:cNvPicPr>
                   </pic:nvPicPr>
                   <pic:blipFill>
-                    <a:blip r:embed="rId48"/>
+                    <a:blip r:embed="rId49"/>
                     <a:stretch>
                       <a:fillRect/>
                     </a:stretch>
@@ -3356,18 +3361,18 @@
           <wp:inline>
             <wp:extent cx="5334000" cy="1676956"/>
             <wp:effectExtent b="0" l="0" r="0" t="0"/>
-            <wp:docPr descr="MLflow model registry" title="" id="52" name="Picture"/>
+            <wp:docPr descr="MLflow model registry" title="" id="53" name="Picture"/>
             <a:graphic>
               <a:graphicData uri="http://schemas.openxmlformats.org/drawingml/2006/picture">
                 <pic:pic>
                   <pic:nvPicPr>
-                    <pic:cNvPr descr="../screenshots/mlflow_registry.png" id="53" name="Picture"/>
+                    <pic:cNvPr descr="../screenshots/mlflow_registry.png" id="54" name="Picture"/>
                     <pic:cNvPicPr>
                       <a:picLocks noChangeArrowheads="1" noChangeAspect="1"/>
                     </pic:cNvPicPr>
                   </pic:nvPicPr>
                   <pic:blipFill>
-                    <a:blip r:embed="rId51"/>
+                    <a:blip r:embed="rId52"/>
                     <a:stretch>
                       <a:fillRect/>
                     </a:stretch>
@@ -3402,8 +3407,8 @@
         <w:t xml:space="preserve">MLflow model registry</w:t>
       </w:r>
     </w:p>
-    <w:bookmarkEnd w:id="54"/>
-    <w:bookmarkStart w:id="55" w:name="packaging-and-reproducibility"/>
+    <w:bookmarkEnd w:id="55"/>
+    <w:bookmarkStart w:id="56" w:name="packaging-and-reproducibility"/>
     <w:p>
       <w:pPr>
         <w:pStyle w:val="Heading1"/>
@@ -3605,8 +3610,8 @@
         <w:t xml:space="preserve">package, so no logic is copied into notebooks.</w:t>
       </w:r>
     </w:p>
-    <w:bookmarkEnd w:id="55"/>
-    <w:bookmarkStart w:id="64" w:name="cicd-pipeline-and-automated-testing"/>
+    <w:bookmarkEnd w:id="56"/>
+    <w:bookmarkStart w:id="65" w:name="cicd-pipeline-and-automated-testing"/>
     <w:p>
       <w:pPr>
         <w:pStyle w:val="Heading1"/>
@@ -3615,7 +3620,7 @@
         <w:t xml:space="preserve">7. CI/CD pipeline and automated testing</w:t>
       </w:r>
     </w:p>
-    <w:bookmarkStart w:id="56" w:name="unit-tests-tests-25-tests"/>
+    <w:bookmarkStart w:id="57" w:name="unit-tests-tests-25-tests"/>
     <w:p>
       <w:pPr>
         <w:pStyle w:val="Heading2"/>
@@ -3827,8 +3832,8 @@
         <w:t xml:space="preserve">clone without the real dataset or a trained model.</w:t>
       </w:r>
     </w:p>
-    <w:bookmarkEnd w:id="56"/>
-    <w:bookmarkStart w:id="63" w:name="github-actions-.githubworkflowsci.yml"/>
+    <w:bookmarkEnd w:id="57"/>
+    <w:bookmarkStart w:id="64" w:name="github-actions-.githubworkflowsci.yml"/>
     <w:p>
       <w:pPr>
         <w:pStyle w:val="Heading2"/>
@@ -4256,18 +4261,18 @@
           <wp:inline>
             <wp:extent cx="5334000" cy="2363868"/>
             <wp:effectExtent b="0" l="0" r="0" t="0"/>
-            <wp:docPr descr="GitHub Actions run" title="" id="58" name="Picture"/>
+            <wp:docPr descr="GitHub Actions run" title="" id="59" name="Picture"/>
             <a:graphic>
               <a:graphicData uri="http://schemas.openxmlformats.org/drawingml/2006/picture">
                 <pic:pic>
                   <pic:nvPicPr>
-                    <pic:cNvPr descr="../screenshots/github_actions_run.png" id="59" name="Picture"/>
+                    <pic:cNvPr descr="../screenshots/github_actions_run.png" id="60" name="Picture"/>
                     <pic:cNvPicPr>
                       <a:picLocks noChangeArrowheads="1" noChangeAspect="1"/>
                     </pic:cNvPicPr>
                   </pic:nvPicPr>
                   <pic:blipFill>
-                    <a:blip r:embed="rId57"/>
+                    <a:blip r:embed="rId58"/>
                     <a:stretch>
                       <a:fillRect/>
                     </a:stretch>
@@ -4311,18 +4316,18 @@
           <wp:inline>
             <wp:extent cx="5334000" cy="2651632"/>
             <wp:effectExtent b="0" l="0" r="0" t="0"/>
-            <wp:docPr descr="GitHub Actions artifacts" title="" id="61" name="Picture"/>
+            <wp:docPr descr="GitHub Actions artifacts" title="" id="62" name="Picture"/>
             <a:graphic>
               <a:graphicData uri="http://schemas.openxmlformats.org/drawingml/2006/picture">
                 <pic:pic>
                   <pic:nvPicPr>
-                    <pic:cNvPr descr="../screenshots/github_actions_artifacts.png" id="62" name="Picture"/>
+                    <pic:cNvPr descr="../screenshots/github_actions_artifacts.png" id="63" name="Picture"/>
                     <pic:cNvPicPr>
                       <a:picLocks noChangeArrowheads="1" noChangeAspect="1"/>
                     </pic:cNvPicPr>
                   </pic:nvPicPr>
                   <pic:blipFill>
-                    <a:blip r:embed="rId60"/>
+                    <a:blip r:embed="rId61"/>
                     <a:stretch>
                       <a:fillRect/>
                     </a:stretch>
@@ -4357,9 +4362,9 @@
         <w:t xml:space="preserve">GitHub Actions artifacts</w:t>
       </w:r>
     </w:p>
-    <w:bookmarkEnd w:id="63"/>
     <w:bookmarkEnd w:id="64"/>
-    <w:bookmarkStart w:id="68" w:name="containerisation"/>
+    <w:bookmarkEnd w:id="65"/>
+    <w:bookmarkStart w:id="69" w:name="containerisation"/>
     <w:p>
       <w:pPr>
         <w:pStyle w:val="Heading1"/>
@@ -4914,18 +4919,18 @@
           <wp:inline>
             <wp:extent cx="5334000" cy="926331"/>
             <wp:effectExtent b="0" l="0" r="0" t="0"/>
-            <wp:docPr descr="Docker build and run" title="" id="66" name="Picture"/>
+            <wp:docPr descr="Docker build and run" title="" id="67" name="Picture"/>
             <a:graphic>
               <a:graphicData uri="http://schemas.openxmlformats.org/drawingml/2006/picture">
                 <pic:pic>
                   <pic:nvPicPr>
-                    <pic:cNvPr descr="../screenshots/docker_build_run.png" id="67" name="Picture"/>
+                    <pic:cNvPr descr="../screenshots/docker_build_run.png" id="68" name="Picture"/>
                     <pic:cNvPicPr>
                       <a:picLocks noChangeArrowheads="1" noChangeAspect="1"/>
                     </pic:cNvPicPr>
                   </pic:nvPicPr>
                   <pic:blipFill>
-                    <a:blip r:embed="rId65"/>
+                    <a:blip r:embed="rId66"/>
                     <a:stretch>
                       <a:fillRect/>
                     </a:stretch>
@@ -4960,8 +4965,8 @@
         <w:t xml:space="preserve">Docker build and run</w:t>
       </w:r>
     </w:p>
-    <w:bookmarkEnd w:id="68"/>
-    <w:bookmarkStart w:id="78" w:name="production-deployment-kubernetes"/>
+    <w:bookmarkEnd w:id="69"/>
+    <w:bookmarkStart w:id="79" w:name="production-deployment-kubernetes"/>
     <w:p>
       <w:pPr>
         <w:pStyle w:val="Heading1"/>
@@ -5223,18 +5228,18 @@
           <wp:inline>
             <wp:extent cx="5334000" cy="1794123"/>
             <wp:effectExtent b="0" l="0" r="0" t="0"/>
-            <wp:docPr descr="kubectl get pods,svc" title="" id="70" name="Picture"/>
+            <wp:docPr descr="kubectl get pods,svc" title="" id="71" name="Picture"/>
             <a:graphic>
               <a:graphicData uri="http://schemas.openxmlformats.org/drawingml/2006/picture">
                 <pic:pic>
                   <pic:nvPicPr>
-                    <pic:cNvPr descr="../screenshots/k8s_pods_services.png" id="71" name="Picture"/>
+                    <pic:cNvPr descr="../screenshots/k8s_pods_services.png" id="72" name="Picture"/>
                     <pic:cNvPicPr>
                       <a:picLocks noChangeArrowheads="1" noChangeAspect="1"/>
                     </pic:cNvPicPr>
                   </pic:nvPicPr>
                   <pic:blipFill>
-                    <a:blip r:embed="rId69"/>
+                    <a:blip r:embed="rId70"/>
                     <a:stretch>
                       <a:fillRect/>
                     </a:stretch>
@@ -5278,18 +5283,18 @@
           <wp:inline>
             <wp:extent cx="5334000" cy="3123087"/>
             <wp:effectExtent b="0" l="0" r="0" t="0"/>
-            <wp:docPr descr="Docker Desktop Kubernetes view (namespace heart-mlops)" title="" id="73" name="Picture"/>
+            <wp:docPr descr="Docker Desktop Kubernetes view (namespace heart-mlops)" title="" id="74" name="Picture"/>
             <a:graphic>
               <a:graphicData uri="http://schemas.openxmlformats.org/drawingml/2006/picture">
                 <pic:pic>
                   <pic:nvPicPr>
-                    <pic:cNvPr descr="../screenshots/docker_desktop_k8s.png" id="74" name="Picture"/>
+                    <pic:cNvPr descr="../screenshots/docker_desktop_k8s.png" id="75" name="Picture"/>
                     <pic:cNvPicPr>
                       <a:picLocks noChangeArrowheads="1" noChangeAspect="1"/>
                     </pic:cNvPicPr>
                   </pic:nvPicPr>
                   <pic:blipFill>
-                    <a:blip r:embed="rId72"/>
+                    <a:blip r:embed="rId73"/>
                     <a:stretch>
                       <a:fillRect/>
                     </a:stretch>
@@ -5333,18 +5338,18 @@
           <wp:inline>
             <wp:extent cx="5334000" cy="3063728"/>
             <wp:effectExtent b="0" l="0" r="0" t="0"/>
-            <wp:docPr descr="Smoke test through the LoadBalancer, followed by the pods’ JSON request logs" title="" id="76" name="Picture"/>
+            <wp:docPr descr="Smoke test through the LoadBalancer, followed by the pods’ JSON request logs" title="" id="77" name="Picture"/>
             <a:graphic>
               <a:graphicData uri="http://schemas.openxmlformats.org/drawingml/2006/picture">
                 <pic:pic>
                   <pic:nvPicPr>
-                    <pic:cNvPr descr="../screenshots/k8s_predict.png" id="77" name="Picture"/>
+                    <pic:cNvPr descr="../screenshots/k8s_predict.png" id="78" name="Picture"/>
                     <pic:cNvPicPr>
                       <a:picLocks noChangeArrowheads="1" noChangeAspect="1"/>
                     </pic:cNvPicPr>
                   </pic:nvPicPr>
                   <pic:blipFill>
-                    <a:blip r:embed="rId75"/>
+                    <a:blip r:embed="rId76"/>
                     <a:stretch>
                       <a:fillRect/>
                     </a:stretch>
@@ -5379,8 +5384,8 @@
         <w:t xml:space="preserve">Smoke test through the LoadBalancer, followed by the pods’ JSON request logs</w:t>
       </w:r>
     </w:p>
-    <w:bookmarkEnd w:id="78"/>
-    <w:bookmarkStart w:id="88" w:name="monitoring-and-logging"/>
+    <w:bookmarkEnd w:id="79"/>
+    <w:bookmarkStart w:id="89" w:name="monitoring-and-logging"/>
     <w:p>
       <w:pPr>
         <w:pStyle w:val="Heading1"/>
@@ -5845,18 +5850,18 @@
           <wp:inline>
             <wp:extent cx="5334000" cy="2646131"/>
             <wp:effectExtent b="0" l="0" r="0" t="0"/>
-            <wp:docPr descr="Grafana dashboard: status, throughput and latency" title="" id="80" name="Picture"/>
+            <wp:docPr descr="Grafana dashboard: status, throughput and latency" title="" id="81" name="Picture"/>
             <a:graphic>
               <a:graphicData uri="http://schemas.openxmlformats.org/drawingml/2006/picture">
                 <pic:pic>
                   <pic:nvPicPr>
-                    <pic:cNvPr descr="../screenshots/grafana_dashboard.png" id="81" name="Picture"/>
+                    <pic:cNvPr descr="../screenshots/grafana_dashboard.png" id="82" name="Picture"/>
                     <pic:cNvPicPr>
                       <a:picLocks noChangeArrowheads="1" noChangeAspect="1"/>
                     </pic:cNvPicPr>
                   </pic:nvPicPr>
                   <pic:blipFill>
-                    <a:blip r:embed="rId79"/>
+                    <a:blip r:embed="rId80"/>
                     <a:stretch>
                       <a:fillRect/>
                     </a:stretch>
@@ -5900,18 +5905,18 @@
           <wp:inline>
             <wp:extent cx="5334000" cy="2639189"/>
             <wp:effectExtent b="0" l="0" r="0" t="0"/>
-            <wp:docPr descr="Grafana dashboard: class mix, probability distribution and response codes" title="" id="83" name="Picture"/>
+            <wp:docPr descr="Grafana dashboard: class mix, probability distribution and response codes" title="" id="84" name="Picture"/>
             <a:graphic>
               <a:graphicData uri="http://schemas.openxmlformats.org/drawingml/2006/picture">
                 <pic:pic>
                   <pic:nvPicPr>
-                    <pic:cNvPr descr="../screenshots/grafana_dashboard_2.png" id="84" name="Picture"/>
+                    <pic:cNvPr descr="../screenshots/grafana_dashboard_2.png" id="85" name="Picture"/>
                     <pic:cNvPicPr>
                       <a:picLocks noChangeArrowheads="1" noChangeAspect="1"/>
                     </pic:cNvPicPr>
                   </pic:nvPicPr>
                   <pic:blipFill>
-                    <a:blip r:embed="rId82"/>
+                    <a:blip r:embed="rId83"/>
                     <a:stretch>
                       <a:fillRect/>
                     </a:stretch>
@@ -5955,18 +5960,18 @@
           <wp:inline>
             <wp:extent cx="5334000" cy="2380554"/>
             <wp:effectExtent b="0" l="0" r="0" t="0"/>
-            <wp:docPr descr="Prometheus targets" title="" id="86" name="Picture"/>
+            <wp:docPr descr="Prometheus targets" title="" id="87" name="Picture"/>
             <a:graphic>
               <a:graphicData uri="http://schemas.openxmlformats.org/drawingml/2006/picture">
                 <pic:pic>
                   <pic:nvPicPr>
-                    <pic:cNvPr descr="../screenshots/prometheus_targets.png" id="87" name="Picture"/>
+                    <pic:cNvPr descr="../screenshots/prometheus_targets.png" id="88" name="Picture"/>
                     <pic:cNvPicPr>
                       <a:picLocks noChangeArrowheads="1" noChangeAspect="1"/>
                     </pic:cNvPicPr>
                   </pic:nvPicPr>
                   <pic:blipFill>
-                    <a:blip r:embed="rId85"/>
+                    <a:blip r:embed="rId86"/>
                     <a:stretch>
                       <a:fillRect/>
                     </a:stretch>
@@ -6001,8 +6006,8 @@
         <w:t xml:space="preserve">Prometheus targets</w:t>
       </w:r>
     </w:p>
-    <w:bookmarkEnd w:id="88"/>
-    <w:bookmarkStart w:id="89" w:name="limitations-and-next-steps"/>
+    <w:bookmarkEnd w:id="89"/>
+    <w:bookmarkStart w:id="90" w:name="limitations-and-next-steps"/>
     <w:p>
       <w:pPr>
         <w:pStyle w:val="Heading1"/>
@@ -6159,8 +6164,8 @@
         <w:t xml:space="preserve">with Evidently.</w:t>
       </w:r>
     </w:p>
-    <w:bookmarkEnd w:id="89"/>
-    <w:bookmarkStart w:id="90" w:name="deliverables-checklist"/>
+    <w:bookmarkEnd w:id="90"/>
+    <w:bookmarkStart w:id="91" w:name="deliverables-checklist"/>
     <w:p>
       <w:pPr>
         <w:pStyle w:val="Heading1"/>
@@ -6658,7 +6663,7 @@
         </w:tc>
       </w:tr>
     </w:tbl>
-    <w:bookmarkEnd w:id="90"/>
+    <w:bookmarkEnd w:id="91"/>
     <w:sectPr>
       <w:footnotePr>
         <w:numRestart w:val="eachSect"/>

</xml_diff>